<commit_message>
feat(template): add signature block fields to Common Paper Mutual NDA
- Add 10 optional signatory fields (party_N_type, name, title, company,
  email) to metadata.yaml with entity/individual enum toggle
- Insert {field} placeholders into the DOCX signature table
- Add deriveSignatoryFields() helper in engine.ts to compute display
  fields: title/company resolve to empty string for individuals,
  respecting the one-IF-per-row docx-templates constraint
- Add 3 integration tests (OA-NDA-001 through OA-NDA-003) covering
  entity mode, mixed individual mode, and warning emission
- Define corresponding OpenSpec scenarios in spec.md
- Rewrite README fields table organized by section (Terms, Legal,
  Signature Block)
</commit_message>
<xml_diff>
--- a/content/templates/common-paper-mutual-nda/template.docx
+++ b/content/templates/common-paper-mutual-nda/template.docx
@@ -1392,6 +1392,14 @@
                 <w:szCs w:val="18"/>
               </w:rPr>
             </w:pPr>
+            <w:r>
+              <w:rPr>
+                <w:rFonts w:ascii="Arial" w:eastAsia="Arial" w:hAnsi="Arial" w:cs="Arial"/>
+                <w:sz w:val="18"/>
+                <w:szCs w:val="18"/>
+              </w:rPr>
+              <w:t>{party_1_name}</w:t>
+            </w:r>
           </w:p>
         </w:tc>
         <w:tc>
@@ -1442,6 +1450,14 @@
                 <w:szCs w:val="18"/>
               </w:rPr>
             </w:pPr>
+            <w:r>
+              <w:rPr>
+                <w:rFonts w:ascii="Arial" w:eastAsia="Arial" w:hAnsi="Arial" w:cs="Arial"/>
+                <w:sz w:val="18"/>
+                <w:szCs w:val="18"/>
+              </w:rPr>
+              <w:t>{party_2_name}</w:t>
+            </w:r>
           </w:p>
         </w:tc>
       </w:tr>
@@ -1504,6 +1520,14 @@
                 <w:szCs w:val="18"/>
               </w:rPr>
             </w:pPr>
+            <w:r>
+              <w:rPr>
+                <w:rFonts w:ascii="Arial" w:eastAsia="Arial" w:hAnsi="Arial" w:cs="Arial"/>
+                <w:sz w:val="18"/>
+                <w:szCs w:val="18"/>
+              </w:rPr>
+              <w:t>{party_1_title_display}</w:t>
+            </w:r>
           </w:p>
         </w:tc>
         <w:tc>
@@ -1554,6 +1578,14 @@
                 <w:szCs w:val="18"/>
               </w:rPr>
             </w:pPr>
+            <w:r>
+              <w:rPr>
+                <w:rFonts w:ascii="Arial" w:eastAsia="Arial" w:hAnsi="Arial" w:cs="Arial"/>
+                <w:sz w:val="18"/>
+                <w:szCs w:val="18"/>
+              </w:rPr>
+              <w:t>{party_2_title_display}</w:t>
+            </w:r>
           </w:p>
         </w:tc>
       </w:tr>
@@ -1616,6 +1648,14 @@
                 <w:szCs w:val="18"/>
               </w:rPr>
             </w:pPr>
+            <w:r>
+              <w:rPr>
+                <w:rFonts w:ascii="Arial" w:eastAsia="Arial" w:hAnsi="Arial" w:cs="Arial"/>
+                <w:sz w:val="18"/>
+                <w:szCs w:val="18"/>
+              </w:rPr>
+              <w:t>{party_1_company_display}</w:t>
+            </w:r>
           </w:p>
         </w:tc>
         <w:tc>
@@ -1666,6 +1706,14 @@
                 <w:szCs w:val="18"/>
               </w:rPr>
             </w:pPr>
+            <w:r>
+              <w:rPr>
+                <w:rFonts w:ascii="Arial" w:eastAsia="Arial" w:hAnsi="Arial" w:cs="Arial"/>
+                <w:sz w:val="18"/>
+                <w:szCs w:val="18"/>
+              </w:rPr>
+              <w:t>{party_2_company_display}</w:t>
+            </w:r>
           </w:p>
         </w:tc>
       </w:tr>
@@ -1750,6 +1798,14 @@
                 <w:szCs w:val="18"/>
               </w:rPr>
             </w:pPr>
+            <w:r>
+              <w:rPr>
+                <w:rFonts w:ascii="Arial" w:eastAsia="Arial" w:hAnsi="Arial" w:cs="Arial"/>
+                <w:sz w:val="18"/>
+                <w:szCs w:val="18"/>
+              </w:rPr>
+              <w:t>{party_1_email}</w:t>
+            </w:r>
           </w:p>
         </w:tc>
         <w:tc>
@@ -1800,6 +1856,14 @@
                 <w:szCs w:val="18"/>
               </w:rPr>
             </w:pPr>
+            <w:r>
+              <w:rPr>
+                <w:rFonts w:ascii="Arial" w:eastAsia="Arial" w:hAnsi="Arial" w:cs="Arial"/>
+                <w:sz w:val="18"/>
+                <w:szCs w:val="18"/>
+              </w:rPr>
+              <w:t>{party_2_email}</w:t>
+            </w:r>
           </w:p>
         </w:tc>
       </w:tr>

</xml_diff>